<commit_message>
Added latency testing for getsure dtection over serial
</commit_message>
<xml_diff>
--- a/ResearchPaper(InProgress)/ValidationTesting.docx
+++ b/ResearchPaper(InProgress)/ValidationTesting.docx
@@ -178,6 +178,22 @@
       <w:pPr>
         <w:pStyle w:val="Normal"/>
         <w:numPr>
+          <w:ilvl w:val="0"/>
+          <w:numId w:val="1"/>
+        </w:numPr>
+        <w:bidi w:val="0"/>
+        <w:jc w:val="start"/>
+        <w:rPr/>
+      </w:pPr>
+      <w:r>
+        <w:rPr/>
+        <w:t>End to End Delay for Gestures</w:t>
+      </w:r>
+    </w:p>
+    <w:p>
+      <w:pPr>
+        <w:pStyle w:val="Normal"/>
+        <w:numPr>
           <w:ilvl w:val="1"/>
           <w:numId w:val="1"/>
         </w:numPr>
@@ -187,6 +203,71 @@
       </w:pPr>
       <w:r>
         <w:rPr/>
+        <w:t>Serial Test</w:t>
+      </w:r>
+    </w:p>
+    <w:p>
+      <w:pPr>
+        <w:pStyle w:val="Normal"/>
+        <w:numPr>
+          <w:ilvl w:val="2"/>
+          <w:numId w:val="1"/>
+        </w:numPr>
+        <w:bidi w:val="0"/>
+        <w:jc w:val="start"/>
+        <w:rPr/>
+      </w:pPr>
+      <w:r>
+        <w:rPr/>
+        <w:t>G1-&gt;Base: 5 frames</w:t>
+      </w:r>
+    </w:p>
+    <w:p>
+      <w:pPr>
+        <w:pStyle w:val="Normal"/>
+        <w:numPr>
+          <w:ilvl w:val="2"/>
+          <w:numId w:val="1"/>
+        </w:numPr>
+        <w:bidi w:val="0"/>
+        <w:jc w:val="start"/>
+        <w:rPr/>
+      </w:pPr>
+      <w:r>
+        <w:rPr/>
+        <w:t>Base-&gt;G2 5-6 frames</w:t>
+      </w:r>
+    </w:p>
+    <w:p>
+      <w:pPr>
+        <w:pStyle w:val="Normal"/>
+        <w:numPr>
+          <w:ilvl w:val="2"/>
+          <w:numId w:val="1"/>
+        </w:numPr>
+        <w:bidi w:val="0"/>
+        <w:jc w:val="start"/>
+        <w:rPr/>
+      </w:pPr>
+      <w:r>
+        <w:rPr/>
+        <w:t>G2 -&gt; G4 7 frames</w:t>
+      </w:r>
+    </w:p>
+    <w:p>
+      <w:pPr>
+        <w:pStyle w:val="Normal"/>
+        <w:numPr>
+          <w:ilvl w:val="2"/>
+          <w:numId w:val="1"/>
+        </w:numPr>
+        <w:bidi w:val="0"/>
+        <w:jc w:val="start"/>
+        <w:rPr/>
+      </w:pPr>
+      <w:r>
+        <w:rPr/>
+        <w:t>G4 -&gt; G3 15 frames</w:t>
       </w:r>
     </w:p>
     <w:sectPr>

</xml_diff>